<commit_message>
Attach updated resume (PDF and DOCX) across portfolio website
</commit_message>
<xml_diff>
--- a/KRITIKAPERTI_RESUME.docx
+++ b/KRITIKAPERTI_RESUME.docx
@@ -479,23 +479,6 @@
       </w:r>
       <w:r>
         <w:t xml:space="preserve"> Workbench</w:t>
-      </w:r>
-    </w:p>
-    <w:p>
-      <w:pPr>
-        <w:keepNext/>
-        <w:pBdr>
-          <w:bottom w:val="single" w:sz="6" w:space="2" w:color="94A3B8"/>
-        </w:pBdr>
-        <w:spacing w:before="220" w:after="80"/>
-      </w:pPr>
-      <w:r>
-        <w:rPr>
-          <w:b/>
-          <w:color w:val="0F172A"/>
-          <w:sz w:val="24"/>
-        </w:rPr>
-        <w:t>PROFESSIONAL EXPERIENCE</w:t>
       </w:r>
     </w:p>
     <w:p>
@@ -523,9 +506,17 @@
     </w:p>
     <w:p>
       <w:pPr>
+        <w:pStyle w:val="ListParagraph"/>
         <w:keepNext/>
+        <w:numPr>
+          <w:ilvl w:val="0"/>
+          <w:numId w:val="11"/>
+        </w:numPr>
         <w:spacing w:before="100" w:after="40"/>
       </w:pPr>
+      <w:r>
+        <w:t>Portfolio Website</w:t>
+      </w:r>
     </w:p>
     <w:p>
       <w:pPr>
@@ -541,7 +532,15 @@
           <w:color w:val="0F172A"/>
           <w:sz w:val="24"/>
         </w:rPr>
-        <w:t>EDUCATION</w:t>
+        <w:t>E</w:t>
+      </w:r>
+      <w:r>
+        <w:rPr>
+          <w:b/>
+          <w:color w:val="0F172A"/>
+          <w:sz w:val="24"/>
+        </w:rPr>
+        <w:t>DUCATION</w:t>
       </w:r>
     </w:p>
     <w:p>
@@ -872,31 +871,7 @@
           <w:lang w:val="en-IN"/>
         </w:rPr>
         <w:br/>
-        <w:t>• Stream: Science (PCM) | Percentage: </w:t>
-      </w:r>
-      <w:r>
-        <w:rPr>
-          <w:b/>
-          <w:bCs/>
-          <w:lang w:val="en-IN"/>
-        </w:rPr>
-        <w:t>[</w:t>
-      </w:r>
-      <w:r>
-        <w:rPr>
-          <w:b/>
-          <w:bCs/>
-          <w:lang w:val="en-IN"/>
-        </w:rPr>
-        <w:t>69</w:t>
-      </w:r>
-      <w:r>
-        <w:rPr>
-          <w:b/>
-          <w:bCs/>
-          <w:lang w:val="en-IN"/>
-        </w:rPr>
-        <w:t>%]</w:t>
+        <w:t xml:space="preserve">• Stream: Science (PCM) </w:t>
       </w:r>
     </w:p>
     <w:p>
@@ -1029,53 +1004,6 @@
           <w:lang w:val="en-IN"/>
         </w:rPr>
         <w:t>3</w:t>
-      </w:r>
-      <w:r>
-        <w:rPr>
-          <w:b/>
-          <w:lang w:val="en-IN"/>
-        </w:rPr>
-        <w:br/>
-        <w:t xml:space="preserve">• </w:t>
-      </w:r>
-      <w:proofErr w:type="gramStart"/>
-      <w:r>
-        <w:rPr>
-          <w:b/>
-          <w:lang w:val="en-IN"/>
-        </w:rPr>
-        <w:t>Percentage</w:t>
-      </w:r>
-      <w:r>
-        <w:rPr>
-          <w:b/>
-          <w:lang w:val="en-IN"/>
-        </w:rPr>
-        <w:t xml:space="preserve"> :</w:t>
-      </w:r>
-      <w:proofErr w:type="gramEnd"/>
-      <w:r>
-        <w:rPr>
-          <w:b/>
-          <w:lang w:val="en-IN"/>
-        </w:rPr>
-        <w:t xml:space="preserve"> </w:t>
-      </w:r>
-      <w:r>
-        <w:rPr>
-          <w:b/>
-          <w:bCs/>
-          <w:lang w:val="en-IN"/>
-        </w:rPr>
-        <w:t>[</w:t>
-      </w:r>
-      <w:r>
-        <w:rPr>
-          <w:b/>
-          <w:bCs/>
-          <w:lang w:val="en-IN"/>
-        </w:rPr>
-        <w:t>82%]</w:t>
       </w:r>
     </w:p>
     <w:p>
@@ -1310,7 +1238,6 @@
         </w:rPr>
       </w:pPr>
       <w:r>
-        <w:lastRenderedPageBreak/>
         <w:t>• </w:t>
       </w:r>
       <w:r>
@@ -1360,6 +1287,9 @@
       </w:r>
       <w:r>
         <w:br/>
+      </w:r>
+      <w:r>
+        <w:lastRenderedPageBreak/>
         <w:t>  • Implemented OOP principles (Inheritance, Polymorphism, Encapsulation, Abstraction) and memory management in C++.</w:t>
       </w:r>
     </w:p>
@@ -1778,6 +1708,118 @@
       </w:rPr>
     </w:lvl>
   </w:abstractNum>
+  <w:abstractNum w:abstractNumId="10" w15:restartNumberingAfterBreak="0">
+    <w:nsid w:val="4B694D91"/>
+    <w:multiLevelType w:val="hybridMultilevel"/>
+    <w:tmpl w:val="223A9598"/>
+    <w:lvl w:ilvl="0" w:tplc="BF4C3DDA">
+      <w:numFmt w:val="bullet"/>
+      <w:lvlText w:val=""/>
+      <w:lvlJc w:val="left"/>
+      <w:pPr>
+        <w:ind w:left="720" w:hanging="360"/>
+      </w:pPr>
+      <w:rPr>
+        <w:rFonts w:ascii="Symbol" w:eastAsiaTheme="minorEastAsia" w:hAnsi="Symbol" w:cstheme="minorBidi" w:hint="default"/>
+      </w:rPr>
+    </w:lvl>
+    <w:lvl w:ilvl="1" w:tplc="40090003" w:tentative="1">
+      <w:start w:val="1"/>
+      <w:numFmt w:val="bullet"/>
+      <w:lvlText w:val="o"/>
+      <w:lvlJc w:val="left"/>
+      <w:pPr>
+        <w:ind w:left="1440" w:hanging="360"/>
+      </w:pPr>
+      <w:rPr>
+        <w:rFonts w:ascii="Courier New" w:hAnsi="Courier New" w:cs="Courier New" w:hint="default"/>
+      </w:rPr>
+    </w:lvl>
+    <w:lvl w:ilvl="2" w:tplc="40090005" w:tentative="1">
+      <w:start w:val="1"/>
+      <w:numFmt w:val="bullet"/>
+      <w:lvlText w:val=""/>
+      <w:lvlJc w:val="left"/>
+      <w:pPr>
+        <w:ind w:left="2160" w:hanging="360"/>
+      </w:pPr>
+      <w:rPr>
+        <w:rFonts w:ascii="Wingdings" w:hAnsi="Wingdings" w:hint="default"/>
+      </w:rPr>
+    </w:lvl>
+    <w:lvl w:ilvl="3" w:tplc="40090001" w:tentative="1">
+      <w:start w:val="1"/>
+      <w:numFmt w:val="bullet"/>
+      <w:lvlText w:val=""/>
+      <w:lvlJc w:val="left"/>
+      <w:pPr>
+        <w:ind w:left="2880" w:hanging="360"/>
+      </w:pPr>
+      <w:rPr>
+        <w:rFonts w:ascii="Symbol" w:hAnsi="Symbol" w:hint="default"/>
+      </w:rPr>
+    </w:lvl>
+    <w:lvl w:ilvl="4" w:tplc="40090003" w:tentative="1">
+      <w:start w:val="1"/>
+      <w:numFmt w:val="bullet"/>
+      <w:lvlText w:val="o"/>
+      <w:lvlJc w:val="left"/>
+      <w:pPr>
+        <w:ind w:left="3600" w:hanging="360"/>
+      </w:pPr>
+      <w:rPr>
+        <w:rFonts w:ascii="Courier New" w:hAnsi="Courier New" w:cs="Courier New" w:hint="default"/>
+      </w:rPr>
+    </w:lvl>
+    <w:lvl w:ilvl="5" w:tplc="40090005" w:tentative="1">
+      <w:start w:val="1"/>
+      <w:numFmt w:val="bullet"/>
+      <w:lvlText w:val=""/>
+      <w:lvlJc w:val="left"/>
+      <w:pPr>
+        <w:ind w:left="4320" w:hanging="360"/>
+      </w:pPr>
+      <w:rPr>
+        <w:rFonts w:ascii="Wingdings" w:hAnsi="Wingdings" w:hint="default"/>
+      </w:rPr>
+    </w:lvl>
+    <w:lvl w:ilvl="6" w:tplc="40090001" w:tentative="1">
+      <w:start w:val="1"/>
+      <w:numFmt w:val="bullet"/>
+      <w:lvlText w:val=""/>
+      <w:lvlJc w:val="left"/>
+      <w:pPr>
+        <w:ind w:left="5040" w:hanging="360"/>
+      </w:pPr>
+      <w:rPr>
+        <w:rFonts w:ascii="Symbol" w:hAnsi="Symbol" w:hint="default"/>
+      </w:rPr>
+    </w:lvl>
+    <w:lvl w:ilvl="7" w:tplc="40090003" w:tentative="1">
+      <w:start w:val="1"/>
+      <w:numFmt w:val="bullet"/>
+      <w:lvlText w:val="o"/>
+      <w:lvlJc w:val="left"/>
+      <w:pPr>
+        <w:ind w:left="5760" w:hanging="360"/>
+      </w:pPr>
+      <w:rPr>
+        <w:rFonts w:ascii="Courier New" w:hAnsi="Courier New" w:cs="Courier New" w:hint="default"/>
+      </w:rPr>
+    </w:lvl>
+    <w:lvl w:ilvl="8" w:tplc="40090005" w:tentative="1">
+      <w:start w:val="1"/>
+      <w:numFmt w:val="bullet"/>
+      <w:lvlText w:val=""/>
+      <w:lvlJc w:val="left"/>
+      <w:pPr>
+        <w:ind w:left="6480" w:hanging="360"/>
+      </w:pPr>
+      <w:rPr>
+        <w:rFonts w:ascii="Wingdings" w:hAnsi="Wingdings" w:hint="default"/>
+      </w:rPr>
+    </w:lvl>
+  </w:abstractNum>
   <w:num w:numId="1" w16cid:durableId="1151822800">
     <w:abstractNumId w:val="8"/>
   </w:num>
@@ -1807,6 +1849,9 @@
   </w:num>
   <w:num w:numId="10" w16cid:durableId="745806069">
     <w:abstractNumId w:val="9"/>
+  </w:num>
+  <w:num w:numId="11" w16cid:durableId="371997545">
+    <w:abstractNumId w:val="10"/>
   </w:num>
 </w:numbering>
 </file>

</xml_diff>

<commit_message>
Add active portfolio link https://kritikaperti.vercel.app/ under KEY PROJECTS in resume
</commit_message>
<xml_diff>
--- a/KRITIKAPERTI_RESUME.docx
+++ b/KRITIKAPERTI_RESUME.docx
@@ -515,8 +515,30 @@
         <w:spacing w:before="100" w:after="40"/>
       </w:pPr>
       <w:r>
-        <w:t>Portfolio Website</w:t>
-      </w:r>
+        <w:rPr>
+          <w:b/>
+          <w:bCs/>
+          <w:sz w:val="21"/>
+        </w:rPr>
+        <w:t>Portfolio Website :</w:t>
+      </w:r>
+      <w:r>
+        <w:rPr>
+          <w:sz w:val="21"/>
+        </w:rPr>
+        <w:t xml:space="preserve"> </w:t>
+      </w:r>
+      <w:hyperlink r:id="rId13" w:history="1">
+        <w:r>
+          <w:rPr>
+            <w:rStyle w:val="Hyperlink"/>
+            <w:color w:val="0F4C81"/>
+            <w:u w:val="single"/>
+            <w:sz w:val="21"/>
+          </w:rPr>
+          <w:t>https://kritikaperti.vercel.app/</w:t>
+        </w:r>
+      </w:hyperlink>
     </w:p>
     <w:p>
       <w:pPr>
@@ -532,15 +554,7 @@
           <w:color w:val="0F172A"/>
           <w:sz w:val="24"/>
         </w:rPr>
-        <w:t>E</w:t>
-      </w:r>
-      <w:r>
-        <w:rPr>
-          <w:b/>
-          <w:color w:val="0F172A"/>
-          <w:sz w:val="24"/>
-        </w:rPr>
-        <w:t>DUCATION</w:t>
+        <w:t>EDUCATION</w:t>
       </w:r>
     </w:p>
     <w:p>

</xml_diff>